<commit_message>
cambios finales autoevaluacion lucas
</commit_message>
<xml_diff>
--- a/Experiencia_1 - Planificación de proyecto/Actividad-1 - Autoevaluaciones_Grupo2/1.1_APT122_AutoevaluacionCompetenciasFase1 - Lucas padilla.docx
+++ b/Experiencia_1 - Planificación de proyecto/Actividad-1 - Autoevaluaciones_Grupo2/1.1_APT122_AutoevaluacionCompetenciasFase1 - Lucas padilla.docx
@@ -914,6 +914,15 @@
                 <w:szCs w:val="24"/>
               </w:rPr>
             </w:pPr>
+            <w:r>
+              <w:rPr>
+                <w:rFonts w:eastAsiaTheme="majorEastAsia"/>
+                <w:color w:val="767171" w:themeColor="background2" w:themeShade="80"/>
+                <w:sz w:val="24"/>
+                <w:szCs w:val="24"/>
+              </w:rPr>
+              <w:t xml:space="preserve">Plan de estudio presencial </w:t>
+            </w:r>
           </w:p>
         </w:tc>
       </w:tr>
@@ -969,6 +978,15 @@
                 <w:szCs w:val="24"/>
               </w:rPr>
             </w:pPr>
+            <w:r>
+              <w:rPr>
+                <w:rFonts w:eastAsiaTheme="majorEastAsia"/>
+                <w:color w:val="767171" w:themeColor="background2" w:themeShade="80"/>
+                <w:sz w:val="24"/>
+                <w:szCs w:val="24"/>
+              </w:rPr>
+              <w:t>Año 2023</w:t>
+            </w:r>
           </w:p>
         </w:tc>
       </w:tr>
@@ -1298,13 +1316,19 @@
             <w:pPr>
               <w:jc w:val="center"/>
               <w:rPr>
-                <w:b/>
-                <w:bCs/>
                 <w:color w:val="FF0000"/>
                 <w:sz w:val="18"/>
                 <w:szCs w:val="18"/>
               </w:rPr>
             </w:pPr>
+            <w:r>
+              <w:rPr>
+                <w:color w:val="000000" w:themeColor="text1"/>
+                <w:sz w:val="18"/>
+                <w:szCs w:val="18"/>
+              </w:rPr>
+              <w:t>Diseñar y construir aplicaciones innovadoras para diversas plataformas y dispositivos móviles bajo estándares de calidad y seguridad</w:t>
+            </w:r>
           </w:p>
         </w:tc>
         <w:tc>
@@ -1337,6 +1361,15 @@
                 <w:szCs w:val="18"/>
               </w:rPr>
             </w:pPr>
+            <w:r>
+              <w:rPr>
+                <w:b/>
+                <w:bCs/>
+                <w:sz w:val="18"/>
+                <w:szCs w:val="18"/>
+              </w:rPr>
+              <w:t>X</w:t>
+            </w:r>
           </w:p>
         </w:tc>
         <w:tc>
@@ -1395,12 +1428,17 @@
             <w:pPr>
               <w:jc w:val="center"/>
               <w:rPr>
-                <w:b/>
-                <w:bCs/>
                 <w:sz w:val="18"/>
                 <w:szCs w:val="18"/>
               </w:rPr>
             </w:pPr>
+            <w:r>
+              <w:rPr>
+                <w:sz w:val="18"/>
+                <w:szCs w:val="18"/>
+              </w:rPr>
+              <w:t>Fue el motivo porque me metí a la carrera, si bien no considero ser excelente en este ámbito constantemente busco mejorar</w:t>
+            </w:r>
           </w:p>
         </w:tc>
       </w:tr>
@@ -1417,13 +1455,19 @@
             <w:pPr>
               <w:jc w:val="center"/>
               <w:rPr>
-                <w:b/>
-                <w:bCs/>
                 <w:color w:val="FF0000"/>
                 <w:sz w:val="18"/>
                 <w:szCs w:val="18"/>
               </w:rPr>
             </w:pPr>
+            <w:r>
+              <w:rPr>
+                <w:color w:val="000000" w:themeColor="text1"/>
+                <w:sz w:val="18"/>
+                <w:szCs w:val="18"/>
+              </w:rPr>
+              <w:t>Implementar modelos de aprendizaje automático y análisis analítico avanzado que reduzcan la incertidumbre empresarial</w:t>
+            </w:r>
           </w:p>
         </w:tc>
         <w:tc>
@@ -1472,6 +1516,15 @@
                 <w:szCs w:val="18"/>
               </w:rPr>
             </w:pPr>
+            <w:r>
+              <w:rPr>
+                <w:b/>
+                <w:bCs/>
+                <w:sz w:val="18"/>
+                <w:szCs w:val="18"/>
+              </w:rPr>
+              <w:t>X</w:t>
+            </w:r>
           </w:p>
         </w:tc>
         <w:tc>
@@ -1514,12 +1567,31 @@
             <w:pPr>
               <w:jc w:val="center"/>
               <w:rPr>
-                <w:b/>
-                <w:bCs/>
                 <w:sz w:val="18"/>
                 <w:szCs w:val="18"/>
               </w:rPr>
             </w:pPr>
+            <w:r>
+              <w:rPr>
+                <w:sz w:val="18"/>
+                <w:szCs w:val="18"/>
+              </w:rPr>
+              <w:t xml:space="preserve">No fue algo que le dedicara más </w:t>
+            </w:r>
+            <w:r>
+              <w:rPr>
+                <w:sz w:val="18"/>
+                <w:szCs w:val="18"/>
+              </w:rPr>
+              <w:t>tiempo,</w:t>
+            </w:r>
+            <w:r>
+              <w:rPr>
+                <w:sz w:val="18"/>
+                <w:szCs w:val="18"/>
+              </w:rPr>
+              <w:t xml:space="preserve"> pero si conseguí los dominios aceptables</w:t>
+            </w:r>
           </w:p>
         </w:tc>
       </w:tr>
@@ -1536,12 +1608,17 @@
             <w:pPr>
               <w:jc w:val="center"/>
               <w:rPr>
-                <w:b/>
-                <w:bCs/>
                 <w:sz w:val="18"/>
                 <w:szCs w:val="18"/>
               </w:rPr>
             </w:pPr>
+            <w:r>
+              <w:rPr>
+                <w:sz w:val="18"/>
+                <w:szCs w:val="18"/>
+              </w:rPr>
+              <w:t>Estructurar, almacenar y procesar grandes volúmenes de datos para asegurar su disponibilidad y optimización dentro de la organización</w:t>
+            </w:r>
           </w:p>
         </w:tc>
         <w:tc>
@@ -1574,6 +1651,15 @@
                 <w:szCs w:val="18"/>
               </w:rPr>
             </w:pPr>
+            <w:r>
+              <w:rPr>
+                <w:b/>
+                <w:bCs/>
+                <w:sz w:val="18"/>
+                <w:szCs w:val="18"/>
+              </w:rPr>
+              <w:t>X</w:t>
+            </w:r>
           </w:p>
         </w:tc>
         <w:tc>
@@ -1632,12 +1718,17 @@
             <w:pPr>
               <w:jc w:val="center"/>
               <w:rPr>
-                <w:b/>
-                <w:bCs/>
                 <w:sz w:val="18"/>
                 <w:szCs w:val="18"/>
               </w:rPr>
             </w:pPr>
+            <w:r>
+              <w:rPr>
+                <w:sz w:val="18"/>
+                <w:szCs w:val="18"/>
+              </w:rPr>
+              <w:t>La asignatura relacionada a esta competencia, Big Data fue a la que más tiempo y esfuerzo le dediqué, sin duda he pensado en obtener una certificación en Google sobre esta.</w:t>
+            </w:r>
           </w:p>
         </w:tc>
       </w:tr>
@@ -1654,12 +1745,17 @@
             <w:pPr>
               <w:jc w:val="center"/>
               <w:rPr>
-                <w:b/>
-                <w:bCs/>
                 <w:sz w:val="18"/>
                 <w:szCs w:val="18"/>
               </w:rPr>
             </w:pPr>
+            <w:r>
+              <w:rPr>
+                <w:sz w:val="18"/>
+                <w:szCs w:val="18"/>
+              </w:rPr>
+              <w:t>Evaluar y gestionar proyectos informáticos interdisciplinarios usando metodologías tradicionales y ágiles</w:t>
+            </w:r>
           </w:p>
         </w:tc>
         <w:tc>
@@ -1692,6 +1788,15 @@
                 <w:szCs w:val="18"/>
               </w:rPr>
             </w:pPr>
+            <w:r>
+              <w:rPr>
+                <w:b/>
+                <w:bCs/>
+                <w:sz w:val="18"/>
+                <w:szCs w:val="18"/>
+              </w:rPr>
+              <w:t>X</w:t>
+            </w:r>
           </w:p>
         </w:tc>
         <w:tc>
@@ -1750,12 +1855,17 @@
             <w:pPr>
               <w:jc w:val="center"/>
               <w:rPr>
-                <w:b/>
-                <w:bCs/>
                 <w:sz w:val="18"/>
                 <w:szCs w:val="18"/>
               </w:rPr>
             </w:pPr>
+            <w:r>
+              <w:rPr>
+                <w:sz w:val="18"/>
+                <w:szCs w:val="18"/>
+              </w:rPr>
+              <w:t xml:space="preserve">Le dediqué bastante tiempo junto con Big Data a todo lo relacionado con proyectos, pero siento que me faltaría volver a visitar contenidos específicos para poder tener excelente dominio </w:t>
+            </w:r>
           </w:p>
         </w:tc>
       </w:tr>
@@ -1772,12 +1882,17 @@
             <w:pPr>
               <w:jc w:val="center"/>
               <w:rPr>
-                <w:b/>
-                <w:bCs/>
                 <w:sz w:val="18"/>
                 <w:szCs w:val="18"/>
               </w:rPr>
             </w:pPr>
+            <w:r>
+              <w:rPr>
+                <w:sz w:val="18"/>
+                <w:szCs w:val="18"/>
+              </w:rPr>
+              <w:t>Evaluar y aplicar estándares técnicos, marcos de trabajo regulatorios, ciberseguridad y políticas de calidad</w:t>
+            </w:r>
           </w:p>
         </w:tc>
         <w:tc>
@@ -1826,6 +1941,15 @@
                 <w:szCs w:val="18"/>
               </w:rPr>
             </w:pPr>
+            <w:r>
+              <w:rPr>
+                <w:b/>
+                <w:bCs/>
+                <w:sz w:val="18"/>
+                <w:szCs w:val="18"/>
+              </w:rPr>
+              <w:t>X</w:t>
+            </w:r>
           </w:p>
         </w:tc>
         <w:tc>
@@ -1868,12 +1992,17 @@
             <w:pPr>
               <w:jc w:val="center"/>
               <w:rPr>
-                <w:b/>
-                <w:bCs/>
                 <w:sz w:val="18"/>
                 <w:szCs w:val="18"/>
               </w:rPr>
             </w:pPr>
+            <w:r>
+              <w:rPr>
+                <w:sz w:val="18"/>
+                <w:szCs w:val="18"/>
+              </w:rPr>
+              <w:t>Ciberseguridad no fue la mejor de mis asignaturas en términos de desempeño, pero siento que aprendí bastante, puedo mejorar más a futuro</w:t>
+            </w:r>
           </w:p>
         </w:tc>
       </w:tr>
@@ -1890,12 +2019,17 @@
             <w:pPr>
               <w:jc w:val="center"/>
               <w:rPr>
-                <w:b/>
-                <w:bCs/>
                 <w:sz w:val="18"/>
                 <w:szCs w:val="18"/>
               </w:rPr>
             </w:pPr>
+            <w:r>
+              <w:rPr>
+                <w:sz w:val="18"/>
+                <w:szCs w:val="18"/>
+              </w:rPr>
+              <w:t>Aplicar el pensamiento crítico y la capacidad analítica para innovar en los procesos tecnológicos.</w:t>
+            </w:r>
           </w:p>
         </w:tc>
         <w:tc>
@@ -1928,6 +2062,15 @@
                 <w:szCs w:val="18"/>
               </w:rPr>
             </w:pPr>
+            <w:r>
+              <w:rPr>
+                <w:b/>
+                <w:bCs/>
+                <w:sz w:val="18"/>
+                <w:szCs w:val="18"/>
+              </w:rPr>
+              <w:t>X</w:t>
+            </w:r>
           </w:p>
         </w:tc>
         <w:tc>
@@ -1986,12 +2129,25 @@
             <w:pPr>
               <w:jc w:val="center"/>
               <w:rPr>
-                <w:b/>
-                <w:bCs/>
                 <w:sz w:val="18"/>
                 <w:szCs w:val="18"/>
               </w:rPr>
             </w:pPr>
+            <w:r>
+              <w:rPr>
+                <w:sz w:val="18"/>
+                <w:szCs w:val="18"/>
+              </w:rPr>
+              <w:t xml:space="preserve">El pensamiento crítico y capacidad analítica siento que no me fallan, la innovación sería lo que me limitaría a </w:t>
+            </w:r>
+            <w:r>
+              <w:rPr>
+                <w:sz w:val="18"/>
+                <w:szCs w:val="18"/>
+              </w:rPr>
+              <w:lastRenderedPageBreak/>
+              <w:t>considerarlo un dominio alto y no excelente</w:t>
+            </w:r>
           </w:p>
         </w:tc>
       </w:tr>
@@ -2008,12 +2164,18 @@
             <w:pPr>
               <w:jc w:val="center"/>
               <w:rPr>
-                <w:b/>
-                <w:bCs/>
                 <w:sz w:val="18"/>
                 <w:szCs w:val="18"/>
               </w:rPr>
             </w:pPr>
+            <w:r>
+              <w:rPr>
+                <w:sz w:val="18"/>
+                <w:szCs w:val="18"/>
+              </w:rPr>
+              <w:lastRenderedPageBreak/>
+              <w:t>Desempeñarse de forma eficiente en equipos de trabajo multidisciplinarios</w:t>
+            </w:r>
           </w:p>
         </w:tc>
         <w:tc>
@@ -2030,6 +2192,15 @@
                 <w:szCs w:val="18"/>
               </w:rPr>
             </w:pPr>
+            <w:r>
+              <w:rPr>
+                <w:b/>
+                <w:bCs/>
+                <w:sz w:val="18"/>
+                <w:szCs w:val="18"/>
+              </w:rPr>
+              <w:t>X</w:t>
+            </w:r>
           </w:p>
         </w:tc>
         <w:tc>
@@ -2104,12 +2275,17 @@
             <w:pPr>
               <w:jc w:val="center"/>
               <w:rPr>
-                <w:b/>
-                <w:bCs/>
                 <w:sz w:val="18"/>
                 <w:szCs w:val="18"/>
               </w:rPr>
             </w:pPr>
+            <w:r>
+              <w:rPr>
+                <w:sz w:val="18"/>
+                <w:szCs w:val="18"/>
+              </w:rPr>
+              <w:t>Constantemente trabajé en equipo, busqué que hacer o hacer lo que se me dijera por el líder del grupo también preocupado constantemente sobre mis compañeros en caso de que no puedan realizar x para ayudarlos u orientarnos ambos para realizarla</w:t>
+            </w:r>
           </w:p>
         </w:tc>
       </w:tr>
@@ -2126,12 +2302,17 @@
             <w:pPr>
               <w:jc w:val="center"/>
               <w:rPr>
-                <w:b/>
-                <w:bCs/>
                 <w:sz w:val="18"/>
                 <w:szCs w:val="18"/>
               </w:rPr>
             </w:pPr>
+            <w:r>
+              <w:rPr>
+                <w:sz w:val="18"/>
+                <w:szCs w:val="18"/>
+              </w:rPr>
+              <w:t>Actuar bajo estrictos principios éticos profesionales y mantener una actualización técnica autónoma y constante</w:t>
+            </w:r>
           </w:p>
         </w:tc>
         <w:tc>
@@ -2148,6 +2329,15 @@
                 <w:szCs w:val="18"/>
               </w:rPr>
             </w:pPr>
+            <w:r>
+              <w:rPr>
+                <w:b/>
+                <w:bCs/>
+                <w:sz w:val="18"/>
+                <w:szCs w:val="18"/>
+              </w:rPr>
+              <w:t>X</w:t>
+            </w:r>
           </w:p>
         </w:tc>
         <w:tc>
@@ -2222,12 +2412,17 @@
             <w:pPr>
               <w:jc w:val="center"/>
               <w:rPr>
-                <w:b/>
-                <w:bCs/>
                 <w:sz w:val="18"/>
                 <w:szCs w:val="18"/>
               </w:rPr>
             </w:pPr>
+            <w:r>
+              <w:rPr>
+                <w:sz w:val="18"/>
+                <w:szCs w:val="18"/>
+              </w:rPr>
+              <w:t xml:space="preserve">Con frecuencia me informo sobre cosas que no sabía sobre algún tema competente a mi área de desempeño como Ingeniero Informático y busco mejorar lo que ya sé, que herramientas nuevas están siendo usadas y cuales ya no </w:t>
+            </w:r>
           </w:p>
         </w:tc>
       </w:tr>
@@ -8369,7 +8564,6 @@
   <w:style w:type="character" w:default="1" w:styleId="Fuentedeprrafopredeter">
     <w:name w:val="Default Paragraph Font"/>
     <w:uiPriority w:val="1"/>
-    <w:semiHidden/>
     <w:unhideWhenUsed/>
   </w:style>
   <w:style w:type="table" w:default="1" w:styleId="Tablanormal">
@@ -9670,12 +9864,6 @@
 </file>
 
 <file path=customXml/item1.xml><?xml version="1.0" encoding="utf-8"?>
-<p:properties xmlns:p="http://schemas.microsoft.com/office/2006/metadata/properties" xmlns:xsi="http://www.w3.org/2001/XMLSchema-instance" xmlns:pc="http://schemas.microsoft.com/office/infopath/2007/PartnerControls">
-  <documentManagement/>
-</p:properties>
-</file>
-
-<file path=customXml/item2.xml><?xml version="1.0" encoding="utf-8"?>
 <?mso-contentType ?>
 <FormTemplates xmlns="http://schemas.microsoft.com/sharepoint/v3/contenttype/forms">
   <Display>DocumentLibraryForm</Display>
@@ -9684,11 +9872,13 @@
 </FormTemplates>
 </file>
 
-<file path=customXml/item3.xml><?xml version="1.0" encoding="utf-8"?>
-<b:Sources xmlns:b="http://schemas.openxmlformats.org/officeDocument/2006/bibliography" xmlns="http://schemas.openxmlformats.org/officeDocument/2006/bibliography" SelectedStyle="\APASixthEditionOfficeOnline.xsl" StyleName="APA" Version="6"/>
+<file path=customXml/item2.xml><?xml version="1.0" encoding="utf-8"?>
+<p:properties xmlns:p="http://schemas.microsoft.com/office/2006/metadata/properties" xmlns:xsi="http://www.w3.org/2001/XMLSchema-instance" xmlns:pc="http://schemas.microsoft.com/office/infopath/2007/PartnerControls">
+  <documentManagement/>
+</p:properties>
 </file>
 
-<file path=customXml/item4.xml><?xml version="1.0" encoding="utf-8"?>
+<file path=customXml/item3.xml><?xml version="1.0" encoding="utf-8"?>
 <ct:contentTypeSchema xmlns:ct="http://schemas.microsoft.com/office/2006/metadata/contentType" xmlns:ma="http://schemas.microsoft.com/office/2006/metadata/properties/metaAttributes" ct:_="" ma:_="" ma:contentTypeName="Documento" ma:contentTypeID="0x010100E96778489EE7714D8BD12CC105EB918B" ma:contentTypeVersion="2" ma:contentTypeDescription="Crear nuevo documento." ma:contentTypeScope="" ma:versionID="416c5c7ae9b5d54d83875cd3c65194e3">
   <xsd:schema xmlns:xsd="http://www.w3.org/2001/XMLSchema" xmlns:xs="http://www.w3.org/2001/XMLSchema" xmlns:p="http://schemas.microsoft.com/office/2006/metadata/properties" xmlns:ns2="126e8a1c-9ea9-435a-ac89-d06c80d62e30" targetNamespace="http://schemas.microsoft.com/office/2006/metadata/properties" ma:root="true" ma:fieldsID="70a237c842677bd850644f8595079f5e" ns2:_="">
     <xsd:import namespace="126e8a1c-9ea9-435a-ac89-d06c80d62e30"/>
@@ -9820,7 +10010,19 @@
 </ct:contentTypeSchema>
 </file>
 
+<file path=customXml/item4.xml><?xml version="1.0" encoding="utf-8"?>
+<b:Sources xmlns:b="http://schemas.openxmlformats.org/officeDocument/2006/bibliography" xmlns="http://schemas.openxmlformats.org/officeDocument/2006/bibliography" SelectedStyle="\APASixthEditionOfficeOnline.xsl" StyleName="APA" Version="6"/>
+</file>
+
 <file path=customXml/itemProps1.xml><?xml version="1.0" encoding="utf-8"?>
+<ds:datastoreItem xmlns:ds="http://schemas.openxmlformats.org/officeDocument/2006/customXml" ds:itemID="{DABAA964-10BA-4DBC-ABF2-CDEAC0FAF7AA}">
+  <ds:schemaRefs>
+    <ds:schemaRef ds:uri="http://schemas.microsoft.com/sharepoint/v3/contenttype/forms"/>
+  </ds:schemaRefs>
+</ds:datastoreItem>
+</file>
+
+<file path=customXml/itemProps2.xml><?xml version="1.0" encoding="utf-8"?>
 <ds:datastoreItem xmlns:ds="http://schemas.openxmlformats.org/officeDocument/2006/customXml" ds:itemID="{5F1783E3-BA1C-4CA3-8E32-C9B378BBED03}">
   <ds:schemaRefs>
     <ds:schemaRef ds:uri="http://schemas.microsoft.com/office/2006/metadata/properties"/>
@@ -9829,23 +10031,7 @@
 </ds:datastoreItem>
 </file>
 
-<file path=customXml/itemProps2.xml><?xml version="1.0" encoding="utf-8"?>
-<ds:datastoreItem xmlns:ds="http://schemas.openxmlformats.org/officeDocument/2006/customXml" ds:itemID="{DABAA964-10BA-4DBC-ABF2-CDEAC0FAF7AA}">
-  <ds:schemaRefs>
-    <ds:schemaRef ds:uri="http://schemas.microsoft.com/sharepoint/v3/contenttype/forms"/>
-  </ds:schemaRefs>
-</ds:datastoreItem>
-</file>
-
 <file path=customXml/itemProps3.xml><?xml version="1.0" encoding="utf-8"?>
-<ds:datastoreItem xmlns:ds="http://schemas.openxmlformats.org/officeDocument/2006/customXml" ds:itemID="{6E8A10B9-B765-4F0B-A47F-7CB788CD8F65}">
-  <ds:schemaRefs>
-    <ds:schemaRef ds:uri="http://schemas.openxmlformats.org/officeDocument/2006/bibliography"/>
-  </ds:schemaRefs>
-</ds:datastoreItem>
-</file>
-
-<file path=customXml/itemProps4.xml><?xml version="1.0" encoding="utf-8"?>
 <ds:datastoreItem xmlns:ds="http://schemas.openxmlformats.org/officeDocument/2006/customXml" ds:itemID="{767CD2D5-7A6C-47C3-9B54-C4225C74DD0B}">
   <ds:schemaRefs>
     <ds:schemaRef ds:uri="http://schemas.microsoft.com/office/2006/metadata/contentType"/>
@@ -9861,4 +10047,12 @@
     <ds:schemaRef ds:uri="http://schemas.microsoft.com/internal/obd"/>
   </ds:schemaRefs>
 </ds:datastoreItem>
+</file>
+
+<file path=customXml/itemProps4.xml><?xml version="1.0" encoding="utf-8"?>
+<ds:datastoreItem xmlns:ds="http://schemas.openxmlformats.org/officeDocument/2006/customXml" ds:itemID="{6E8A10B9-B765-4F0B-A47F-7CB788CD8F65}">
+  <ds:schemaRefs>
+    <ds:schemaRef ds:uri="http://schemas.openxmlformats.org/officeDocument/2006/bibliography"/>
+  </ds:schemaRefs>
+</ds:datastoreItem>
 </file>
</xml_diff>